<commit_message>
Move the updated CV into public/ so the site serves the new version
The remote CV update landed at the old root path after the restructure.

Co-Authored-By: Claude Sonnet 5.5 <noreply@anthropic.com>
</commit_message>
<xml_diff>
--- a/public/Atef_Elsaeed_CV.docx
+++ b/public/Atef_Elsaeed_CV.docx
@@ -63,7 +63,7 @@
           <w:sz w:val="19"/>
           <w:szCs w:val="19"/>
         </w:rPr>
-        <w:t xml:space="preserve">+20 102 364 2940</w:t>
+        <w:t xml:space="preserve">+201023642940</w:t>
       </w:r>
       <w:r>
         <w:rPr>
@@ -74,7 +74,7 @@
         </w:rPr>
         <w:t xml:space="preserve"> · </w:t>
       </w:r>
-      <w:hyperlink w:history="1" r:id="rIdcigu_l3fq50ljylmyknpr">
+      <w:hyperlink w:history="1" r:id="rIdsppucnijlsuitfikng8pk">
         <w:r>
           <w:rPr>
             <w:rFonts w:ascii="Calibri" w:cs="Calibri" w:eastAsia="Calibri" w:hAnsi="Calibri"/>
@@ -102,7 +102,7 @@
         </w:rPr>
         <w:t xml:space="preserve">Portfolio: </w:t>
       </w:r>
-      <w:hyperlink w:history="1" r:id="rIdsnkzvulm-georzeu4e-a2">
+      <w:hyperlink w:history="1" r:id="rIduwar_v6_vymi-int6azuy">
         <w:r>
           <w:rPr>
             <w:rFonts w:ascii="Calibri" w:cs="Calibri" w:eastAsia="Calibri" w:hAnsi="Calibri"/>
@@ -130,7 +130,7 @@
       <w:pPr>
         <w:spacing w:after="60"/>
       </w:pPr>
-      <w:hyperlink w:history="1" r:id="rId8fhlhuwwk41ipl58gdsbz">
+      <w:hyperlink w:history="1" r:id="rIddkehokzm8r3few25ppbht">
         <w:r>
           <w:rPr>
             <w:rFonts w:ascii="Calibri" w:cs="Calibri" w:eastAsia="Calibri" w:hAnsi="Calibri"/>
@@ -151,7 +151,7 @@
         </w:rPr>
         <w:t xml:space="preserve"> · </w:t>
       </w:r>
-      <w:hyperlink w:history="1" r:id="rIdymibbbsqygsvfzs64wzs7">
+      <w:hyperlink w:history="1" r:id="rId_6tzt03pwfveggshdp4y_">
         <w:r>
           <w:rPr>
             <w:rFonts w:ascii="Calibri" w:cs="Calibri" w:eastAsia="Calibri" w:hAnsi="Calibri"/>
@@ -172,7 +172,7 @@
         </w:rPr>
         <w:t xml:space="preserve"> · </w:t>
       </w:r>
-      <w:hyperlink w:history="1" r:id="rId-tmaqe7pn4nqnt87rmy9i">
+      <w:hyperlink w:history="1" r:id="rIdre9szlao4btr1sc2wqtye">
         <w:r>
           <w:rPr>
             <w:rFonts w:ascii="Calibri" w:cs="Calibri" w:eastAsia="Calibri" w:hAnsi="Calibri"/>
@@ -193,7 +193,7 @@
         </w:rPr>
         <w:t xml:space="preserve"> · </w:t>
       </w:r>
-      <w:hyperlink w:history="1" r:id="rId2cx7d0ma-bu54oyg3wr29">
+      <w:hyperlink w:history="1" r:id="rIdiwb66mggtn1dmomaylv9i">
         <w:r>
           <w:rPr>
             <w:rFonts w:ascii="Calibri" w:cs="Calibri" w:eastAsia="Calibri" w:hAnsi="Calibri"/>
@@ -237,7 +237,7 @@
           <w:sz w:val="20"/>
           <w:szCs w:val="20"/>
         </w:rPr>
-        <w:t xml:space="preserve">Senior Flutter Developer with 5+ years of experience building and maintaining production mobile apps across fintech, recruitment, government and consumer products, including a lending app with 500K+ downloads. Strong expertise in Flutter, Dart, Clean Architecture, Bloc and Riverpod, with hands-on experience in financial integrations, performance optimization, production monitoring and App Store / Google Play releases. Experienced in owning mobile apps end to end, from architecture to deployment and maintenance; co-founded and built a local marketplace that reached 2,500+ users and 500+ registered businesses within five months of launch.</w:t>
+        <w:t xml:space="preserve">Senior Flutter Developer with 5+ years of experience building and maintaining production mobile apps across fintech, recruitment, government and consumer products, including a lending app with 500K+ downloads. Strong expertise in Flutter, Dart, Clean Architecture, Bloc and Riverpod, with hands-on experience in financial integrations, performance optimization, production monitoring and App Store / Google Play releases. Experienced in owning mobile apps end to end, from architecture to deployment and maintenance, and in leading and mentoring engineering teams; co-founded and built a local marketplace that reached 2,500+ users and 500+ registered businesses within 5 months of launch.</w:t>
       </w:r>
     </w:p>
     <w:p>
@@ -589,7 +589,7 @@
           <w:sz w:val="20"/>
           <w:szCs w:val="20"/>
         </w:rPr>
-        <w:t xml:space="preserve">Built and led a team of 10+ engineers delivering a recruitment system used by multiple companies</w:t>
+        <w:t xml:space="preserve">Hired, built and led a team of 10+ engineers delivering a recruitment system used by multiple companies</w:t>
       </w:r>
     </w:p>
     <w:p>
@@ -608,7 +608,7 @@
           <w:sz w:val="20"/>
           <w:szCs w:val="20"/>
         </w:rPr>
-        <w:t xml:space="preserve">Owned architecture decisions, sprint planning, code reviews and QA processes</w:t>
+        <w:t xml:space="preserve">Owned architecture decisions, sprint planning, code reviews and QA; mentored developers and coordinated with product stakeholders</w:t>
       </w:r>
     </w:p>
     <w:p>
@@ -923,7 +923,7 @@
           <w:sz w:val="20"/>
           <w:szCs w:val="20"/>
         </w:rPr>
-        <w:t xml:space="preserve"> within five months of launch in May 2026</w:t>
+        <w:t xml:space="preserve"> within 5 months of launch in May 2026</w:t>
       </w:r>
     </w:p>
     <w:p>
@@ -991,7 +991,7 @@
         </w:rPr>
         <w:t xml:space="preserve"> · </w:t>
       </w:r>
-      <w:hyperlink w:history="1" r:id="rIds1xi1-pratxca5zhagxyn">
+      <w:hyperlink w:history="1" r:id="rIdjz56od3m_brgwzuqbrkfk">
         <w:r>
           <w:rPr>
             <w:rFonts w:ascii="Calibri" w:cs="Calibri" w:eastAsia="Calibri" w:hAnsi="Calibri"/>
@@ -1012,7 +1012,7 @@
         </w:rPr>
         <w:t xml:space="preserve"> · </w:t>
       </w:r>
-      <w:hyperlink w:history="1" r:id="rId2qx5bx_r_bdaay13kurzi">
+      <w:hyperlink w:history="1" r:id="rIdlh8jgowbzxfv04o-tv-6p">
         <w:r>
           <w:rPr>
             <w:rFonts w:ascii="Calibri" w:cs="Calibri" w:eastAsia="Calibri" w:hAnsi="Calibri"/>
@@ -1105,7 +1105,7 @@
           <w:sz w:val="20"/>
           <w:szCs w:val="20"/>
         </w:rPr>
-        <w:t xml:space="preserve">Manage sprint planning, task allocation and release coordination; improve deployment workflows and system stability</w:t>
+        <w:t xml:space="preserve">Manage sprint planning, task allocation and release coordination with the founding team; improve deployment workflows and system stability</w:t>
       </w:r>
     </w:p>
     <w:p>
@@ -1143,7 +1143,7 @@
         </w:rPr>
         <w:t xml:space="preserve">Full case studies with technical decisions: </w:t>
       </w:r>
-      <w:hyperlink w:history="1" r:id="rId03bzt8houglfoq_82xiqw">
+      <w:hyperlink w:history="1" r:id="rIdl8ve3lfuhdxqjiidbqu-0">
         <w:r>
           <w:rPr>
             <w:rFonts w:ascii="Calibri" w:cs="Calibri" w:eastAsia="Calibri" w:hAnsi="Calibri"/>
@@ -1194,7 +1194,7 @@
         </w:rPr>
         <w:t xml:space="preserve"> · </w:t>
       </w:r>
-      <w:hyperlink w:history="1" r:id="rIdocfu1g36mj-7_lwl5hype">
+      <w:hyperlink w:history="1" r:id="rId4_3ya_bkok-ciifse0zf-">
         <w:r>
           <w:rPr>
             <w:rFonts w:ascii="Calibri" w:cs="Calibri" w:eastAsia="Calibri" w:hAnsi="Calibri"/>
@@ -1215,7 +1215,7 @@
         </w:rPr>
         <w:t xml:space="preserve"> · </w:t>
       </w:r>
-      <w:hyperlink w:history="1" r:id="rId1rcqntpir5rysgcogcz72">
+      <w:hyperlink w:history="1" r:id="rIduakrys9qhjylngwm1a0q6">
         <w:r>
           <w:rPr>
             <w:rFonts w:ascii="Calibri" w:cs="Calibri" w:eastAsia="Calibri" w:hAnsi="Calibri"/>
@@ -1283,7 +1283,7 @@
         </w:rPr>
         <w:t xml:space="preserve"> · </w:t>
       </w:r>
-      <w:hyperlink w:history="1" r:id="rIdnqx90etf1p8jdfffwxr5j">
+      <w:hyperlink w:history="1" r:id="rIdtdbtiwnuzbkq5zm9afjbe">
         <w:r>
           <w:rPr>
             <w:rFonts w:ascii="Calibri" w:cs="Calibri" w:eastAsia="Calibri" w:hAnsi="Calibri"/>
@@ -1304,7 +1304,7 @@
         </w:rPr>
         <w:t xml:space="preserve"> · </w:t>
       </w:r>
-      <w:hyperlink w:history="1" r:id="rIdt_px_czfrm5mb8dsn7njl">
+      <w:hyperlink w:history="1" r:id="rIdd8k1b2ubjp4jommr1q01y">
         <w:r>
           <w:rPr>
             <w:rFonts w:ascii="Calibri" w:cs="Calibri" w:eastAsia="Calibri" w:hAnsi="Calibri"/>
@@ -1372,7 +1372,7 @@
         </w:rPr>
         <w:t xml:space="preserve"> · </w:t>
       </w:r>
-      <w:hyperlink w:history="1" r:id="rId-zwhcsnenui_1cgogur-n">
+      <w:hyperlink w:history="1" r:id="rIdmbllp8anebzui1otpebte">
         <w:r>
           <w:rPr>
             <w:rFonts w:ascii="Calibri" w:cs="Calibri" w:eastAsia="Calibri" w:hAnsi="Calibri"/>
@@ -1393,7 +1393,7 @@
         </w:rPr>
         <w:t xml:space="preserve"> · </w:t>
       </w:r>
-      <w:hyperlink w:history="1" r:id="rId8bc5a2hwneqesnhk371gf">
+      <w:hyperlink w:history="1" r:id="rIdhl-8kbafcb4nsitm9tyar">
         <w:r>
           <w:rPr>
             <w:rFonts w:ascii="Calibri" w:cs="Calibri" w:eastAsia="Calibri" w:hAnsi="Calibri"/>
@@ -1519,7 +1519,7 @@
         </w:rPr>
         <w:t xml:space="preserve"> · </w:t>
       </w:r>
-      <w:hyperlink w:history="1" r:id="rId4buz8rwxewslhj9ftfp4w">
+      <w:hyperlink w:history="1" r:id="rIdozyy4vb4fxj-0k5n38zjp">
         <w:r>
           <w:rPr>
             <w:rFonts w:ascii="Calibri" w:cs="Calibri" w:eastAsia="Calibri" w:hAnsi="Calibri"/>
@@ -1540,7 +1540,7 @@
         </w:rPr>
         <w:t xml:space="preserve"> · </w:t>
       </w:r>
-      <w:hyperlink w:history="1" r:id="rIdpqeafopmlmgnxggj7lmyj">
+      <w:hyperlink w:history="1" r:id="rIdpxkgs27wwqimnkwlsvhav">
         <w:r>
           <w:rPr>
             <w:rFonts w:ascii="Calibri" w:cs="Calibri" w:eastAsia="Calibri" w:hAnsi="Calibri"/>
@@ -1627,7 +1627,7 @@
         </w:rPr>
         <w:t xml:space="preserve"> · </w:t>
       </w:r>
-      <w:hyperlink w:history="1" r:id="rIdkijv1v_xrgl9fuazenybf">
+      <w:hyperlink w:history="1" r:id="rIdxfzzylfnrbxr96qr9qtzz">
         <w:r>
           <w:rPr>
             <w:rFonts w:ascii="Calibri" w:cs="Calibri" w:eastAsia="Calibri" w:hAnsi="Calibri"/>
@@ -1648,7 +1648,7 @@
         </w:rPr>
         <w:t xml:space="preserve"> · </w:t>
       </w:r>
-      <w:hyperlink w:history="1" r:id="rIdea5rb-qmqfmhtdlfwfwqy">
+      <w:hyperlink w:history="1" r:id="rIdvkcgfrf2qbimreiktddmo">
         <w:r>
           <w:rPr>
             <w:rFonts w:ascii="Calibri" w:cs="Calibri" w:eastAsia="Calibri" w:hAnsi="Calibri"/>
@@ -1716,7 +1716,7 @@
         </w:rPr>
         <w:t xml:space="preserve"> · </w:t>
       </w:r>
-      <w:hyperlink w:history="1" r:id="rIdgikeuniwueir04djla03i">
+      <w:hyperlink w:history="1" r:id="rIdyxximbaw7jenqkvmnfrxf">
         <w:r>
           <w:rPr>
             <w:rFonts w:ascii="Calibri" w:cs="Calibri" w:eastAsia="Calibri" w:hAnsi="Calibri"/>
@@ -1737,7 +1737,7 @@
         </w:rPr>
         <w:t xml:space="preserve"> · </w:t>
       </w:r>
-      <w:hyperlink w:history="1" r:id="rIdjwqkawadlowgmt_5hlnoe">
+      <w:hyperlink w:history="1" r:id="rIdkkthxpyqvuwggjlzmt9rd">
         <w:r>
           <w:rPr>
             <w:rFonts w:ascii="Calibri" w:cs="Calibri" w:eastAsia="Calibri" w:hAnsi="Calibri"/>
@@ -1805,7 +1805,7 @@
         </w:rPr>
         <w:t xml:space="preserve"> · </w:t>
       </w:r>
-      <w:hyperlink w:history="1" r:id="rIdmpg84xdpx40vpplg8zbx5">
+      <w:hyperlink w:history="1" r:id="rId4abfhcjhrpft67axp0swb">
         <w:r>
           <w:rPr>
             <w:rFonts w:ascii="Calibri" w:cs="Calibri" w:eastAsia="Calibri" w:hAnsi="Calibri"/>
@@ -1826,7 +1826,7 @@
         </w:rPr>
         <w:t xml:space="preserve"> · </w:t>
       </w:r>
-      <w:hyperlink w:history="1" r:id="rIdj3yzqjasnp14m8izhgiau">
+      <w:hyperlink w:history="1" r:id="rIdvre2ykslr_3-usqdfp49d">
         <w:r>
           <w:rPr>
             <w:rFonts w:ascii="Calibri" w:cs="Calibri" w:eastAsia="Calibri" w:hAnsi="Calibri"/>
@@ -2681,7 +2681,7 @@
                 <w:sz w:val="20"/>
                 <w:szCs w:val="20"/>
               </w:rPr>
-              <w:t xml:space="preserve">Agile/Scrum, Jira, code reviews, mentoring</w:t>
+              <w:t xml:space="preserve">Agile/Scrum, Jira, code reviews, mentoring, hiring, cross-functional collaboration</w:t>
             </w:r>
           </w:p>
         </w:tc>

</xml_diff>

<commit_message>
Mention Belmally in the About text and add it to the CV
- About: three products instead of two, with Belmally; founder badge 3x (English and Arabic)
- CV (docx): add a Founder & Sole Developer block for Belmally ERP under Ventures
- The CV PDF still needs to be exported from Word to match the docx

Co-Authored-By: Claude Sonnet 5.5 <noreply@anthropic.com>
</commit_message>
<xml_diff>
--- a/public/Atef_Elsaeed_CV.docx
+++ b/public/Atef_Elsaeed_CV.docx
@@ -821,6 +821,128 @@
           <w:szCs w:val="21"/>
         </w:rPr>
         <w:t xml:space="preserve">VENTURES</w:t>
+      </w:r>
+    </w:p>
+    <w:p>
+      <w:pPr>
+        <w:keepNext/>
+        <w:spacing w:after="0" w:before="90"/>
+      </w:pPr>
+      <w:r>
+        <w:rPr>
+          <w:rFonts w:ascii="Calibri" w:cs="Calibri" w:eastAsia="Calibri" w:hAnsi="Calibri"/>
+          <w:b/>
+          <w:bCs/>
+          <w:color w:val="0F1B2D"/>
+          <w:sz w:val="21"/>
+          <w:szCs w:val="21"/>
+        </w:rPr>
+        <w:t xml:space="preserve">Founder &amp; Sole Developer</w:t>
+      </w:r>
+      <w:r>
+        <w:rPr>
+          <w:rFonts w:ascii="Calibri" w:cs="Calibri" w:eastAsia="Calibri" w:hAnsi="Calibri"/>
+          <w:b/>
+          <w:bCs/>
+          <w:color w:val="56637A"/>
+          <w:sz w:val="21"/>
+          <w:szCs w:val="21"/>
+        </w:rPr>
+        <w:t xml:space="preserve"> — Belmally ERP</w:t>
+      </w:r>
+    </w:p>
+    <w:p>
+      <w:pPr>
+        <w:keepNext/>
+        <w:spacing w:after="20"/>
+      </w:pPr>
+      <w:r>
+        <w:rPr>
+          <w:rFonts w:ascii="Calibri" w:cs="Calibri" w:eastAsia="Calibri" w:hAnsi="Calibri"/>
+          <w:i/>
+          <w:iCs/>
+          <w:color w:val="56637A"/>
+          <w:sz w:val="19"/>
+          <w:szCs w:val="19"/>
+        </w:rPr>
+        <w:t xml:space="preserve">May 2026 – Present</w:t>
+      </w:r>
+    </w:p>
+    <w:p>
+      <w:pPr>
+        <w:pStyle w:val="ListParagraph"/>
+        <w:numPr>
+          <w:ilvl w:val="0"/>
+          <w:numId w:val="2"/>
+        </w:numPr>
+        <w:spacing w:after="20"/>
+      </w:pPr>
+      <w:r>
+        <w:rPr>
+          <w:rFonts w:ascii="Calibri" w:cs="Calibri" w:eastAsia="Calibri" w:hAnsi="Calibri"/>
+          <w:color w:val="0F1B2D"/>
+          <w:sz w:val="20"/>
+          <w:szCs w:val="20"/>
+        </w:rPr>
+        <w:t xml:space="preserve">Founded and built, as the sole developer, a multi-tenant ERP for distribution, retail and light manufacturing: NestJS and PostgreSQL API, React dashboard, Flutter desktop POS and Flutter field-sales app, in development since May 2026</w:t>
+      </w:r>
+    </w:p>
+    <w:p>
+      <w:pPr>
+        <w:pStyle w:val="ListParagraph"/>
+        <w:numPr>
+          <w:ilvl w:val="0"/>
+          <w:numId w:val="2"/>
+        </w:numPr>
+        <w:spacing w:after="20"/>
+      </w:pPr>
+      <w:r>
+        <w:rPr>
+          <w:rFonts w:ascii="Calibri" w:cs="Calibri" w:eastAsia="Calibri" w:hAnsi="Calibri"/>
+          <w:color w:val="0F1B2D"/>
+          <w:sz w:val="20"/>
+          <w:szCs w:val="20"/>
+        </w:rPr>
+        <w:t xml:space="preserve">Designed double-entry accounting that posts itself from sales, purchases, expenses and returns, per-customer feature-flagged modules, and an offline-capable POS and sales app that sync on reconnect</w:t>
+      </w:r>
+    </w:p>
+    <w:p>
+      <w:pPr>
+        <w:pStyle w:val="ListParagraph"/>
+        <w:numPr>
+          <w:ilvl w:val="0"/>
+          <w:numId w:val="2"/>
+        </w:numPr>
+        <w:spacing w:after="20"/>
+      </w:pPr>
+      <w:r>
+        <w:rPr>
+          <w:rFonts w:ascii="Calibri" w:cs="Calibri" w:eastAsia="Calibri" w:hAnsi="Calibri"/>
+          <w:color w:val="0F1B2D"/>
+          <w:sz w:val="20"/>
+          <w:szCs w:val="20"/>
+        </w:rPr>
+        <w:t xml:space="preserve">Maintain </w:t>
+      </w:r>
+      <w:r>
+        <w:rPr>
+          <w:rFonts w:ascii="Calibri" w:cs="Calibri" w:eastAsia="Calibri" w:hAnsi="Calibri"/>
+          <w:b/>
+          <w:bCs/>
+          <w:color w:val="0F1B2D"/>
+          <w:sz w:val="20"/>
+          <w:szCs w:val="20"/>
+        </w:rPr>
+        <w:t xml:space="preserve">about 520 automated tests</w:t>
+      </w:r>
+      <w:r>
+        <w:rPr>
+          <w:rFonts w:ascii="Calibri" w:cs="Calibri" w:eastAsia="Calibri" w:hAnsi="Calibri"/>
+          <w:color w:val="0F1B2D"/>
+          <w:sz w:val="20"/>
+          <w:szCs w:val="20"/>
+        </w:rPr>
+        <w:t xml:space="preserve">, a shared API contract checked by all four apps, and a CI/CD pipeline on GitHub Actions</w:t>
       </w:r>
     </w:p>
     <w:p>

</xml_diff>